<commit_message>
Update CV documents (PDF and DOCX)
</commit_message>
<xml_diff>
--- a/public/docs/MuthuKarthik-CV.docx
+++ b/public/docs/MuthuKarthik-CV.docx
@@ -110,15 +110,7 @@
           <w:bCs/>
           <w:color w:val="4472C4" w:themeColor="accent1"/>
         </w:rPr>
-        <w:t>APIs</w:t>
-      </w:r>
-      <w:r>
-        <w:rPr>
-          <w:b/>
-          <w:bCs/>
-          <w:color w:val="4472C4" w:themeColor="accent1"/>
-        </w:rPr>
-        <w:t xml:space="preserve"> </w:t>
+        <w:t xml:space="preserve">APIs </w:t>
       </w:r>
       <w:r>
         <w:rPr>
@@ -126,39 +118,7 @@
           <w:bCs/>
           <w:color w:val="3366CC"/>
         </w:rPr>
-        <w:t xml:space="preserve">| </w:t>
-      </w:r>
-      <w:r>
-        <w:rPr>
-          <w:b/>
-          <w:bCs/>
-          <w:color w:val="3366CC"/>
-        </w:rPr>
-        <w:t xml:space="preserve">Azure </w:t>
-      </w:r>
-      <w:r>
-        <w:rPr>
-          <w:b/>
-          <w:bCs/>
-          <w:color w:val="3366CC"/>
-        </w:rPr>
-        <w:t xml:space="preserve">| </w:t>
-      </w:r>
-      <w:r>
-        <w:rPr>
-          <w:b/>
-          <w:bCs/>
-          <w:color w:val="3366CC"/>
-        </w:rPr>
-        <w:t xml:space="preserve">AWS </w:t>
-      </w:r>
-      <w:r>
-        <w:rPr>
-          <w:b/>
-          <w:bCs/>
-          <w:color w:val="3366CC"/>
-        </w:rPr>
-        <w:t>| Application Architecture</w:t>
+        <w:t>| Azure | AWS | Application Architecture</w:t>
       </w:r>
     </w:p>
     <w:p>
@@ -183,21 +143,19 @@
         </w:rPr>
         <w:t>+91-</w:t>
       </w:r>
-      <w:proofErr w:type="gramStart"/>
       <w:r>
         <w:rPr>
           <w:sz w:val="19"/>
           <w:szCs w:val="19"/>
         </w:rPr>
-        <w:t>9976158821  |</w:t>
-      </w:r>
-      <w:proofErr w:type="gramEnd"/>
+        <w:t>6282193058</w:t>
+      </w:r>
       <w:r>
         <w:rPr>
           <w:sz w:val="19"/>
           <w:szCs w:val="19"/>
         </w:rPr>
-        <w:t xml:space="preserve">  </w:t>
+        <w:t xml:space="preserve">  |  </w:t>
       </w:r>
       <w:r>
         <w:rPr>
@@ -209,38 +167,36 @@
         </w:rPr>
         <w:t xml:space="preserve">Email: </w:t>
       </w:r>
-      <w:proofErr w:type="gramStart"/>
       <w:r>
         <w:rPr>
           <w:sz w:val="19"/>
           <w:szCs w:val="19"/>
         </w:rPr>
-        <w:t>mr.muthukarthick@gmail.com  |</w:t>
-      </w:r>
-      <w:proofErr w:type="gramEnd"/>
-      <w:r>
-        <w:rPr>
+        <w:t xml:space="preserve">mr.muthukarthick@gmail.com  |  </w:t>
+      </w:r>
+      <w:r>
+        <w:rPr>
+          <w:b/>
+          <w:bCs/>
+          <w:color w:val="1B2A4A"/>
           <w:sz w:val="19"/>
           <w:szCs w:val="19"/>
         </w:rPr>
-        <w:t xml:space="preserve">  </w:t>
-      </w:r>
-      <w:r>
-        <w:rPr>
-          <w:b/>
-          <w:bCs/>
-          <w:color w:val="1B2A4A"/>
+        <w:t xml:space="preserve">Location: </w:t>
+      </w:r>
+      <w:r>
+        <w:rPr>
           <w:sz w:val="19"/>
           <w:szCs w:val="19"/>
         </w:rPr>
-        <w:t xml:space="preserve">Location: </w:t>
+        <w:t>Tamilnadu</w:t>
       </w:r>
       <w:r>
         <w:rPr>
           <w:sz w:val="19"/>
           <w:szCs w:val="19"/>
         </w:rPr>
-        <w:t>Kerala, India</w:t>
+        <w:t>, India</w:t>
       </w:r>
     </w:p>
     <w:p>
@@ -265,18 +221,8 @@
             <w:sz w:val="19"/>
             <w:szCs w:val="19"/>
           </w:rPr>
-          <w:t>linkedin.com/in/</w:t>
+          <w:t>linkedin.com/in/mr-muthukarthick</w:t>
         </w:r>
-        <w:proofErr w:type="spellStart"/>
-        <w:r>
-          <w:rPr>
-            <w:color w:val="3366CC"/>
-            <w:sz w:val="19"/>
-            <w:szCs w:val="19"/>
-          </w:rPr>
-          <w:t>mr-muthukarthick</w:t>
-        </w:r>
-        <w:proofErr w:type="spellEnd"/>
       </w:hyperlink>
       <w:r>
         <w:rPr>
@@ -302,18 +248,8 @@
             <w:sz w:val="19"/>
             <w:szCs w:val="19"/>
           </w:rPr>
-          <w:t>github.com/</w:t>
+          <w:t>github.com/muthukarthick</w:t>
         </w:r>
-        <w:proofErr w:type="spellStart"/>
-        <w:r>
-          <w:rPr>
-            <w:color w:val="3366CC"/>
-            <w:sz w:val="19"/>
-            <w:szCs w:val="19"/>
-          </w:rPr>
-          <w:t>muthukarthick</w:t>
-        </w:r>
-        <w:proofErr w:type="spellEnd"/>
       </w:hyperlink>
       <w:r>
         <w:t xml:space="preserve"> | </w:t>
@@ -332,7 +268,6 @@
         <w:t xml:space="preserve">Portfolio: </w:t>
       </w:r>
       <w:hyperlink r:id="rId7" w:history="1">
-        <w:proofErr w:type="spellStart"/>
         <w:r>
           <w:rPr>
             <w:rStyle w:val="Hyperlink"/>
@@ -340,7 +275,6 @@
           </w:rPr>
           <w:t>muthukarthik-portfolio.vercel.app</w:t>
         </w:r>
-        <w:proofErr w:type="spellEnd"/>
       </w:hyperlink>
     </w:p>
     <w:p>
@@ -490,15 +424,7 @@
         <w:t xml:space="preserve">Databases: </w:t>
       </w:r>
       <w:r>
-        <w:t xml:space="preserve">MySQL, MongoDB, Database Design, Relational Database </w:t>
-      </w:r>
-      <w:proofErr w:type="spellStart"/>
-      <w:r>
-        <w:t>Modeling</w:t>
-      </w:r>
-      <w:proofErr w:type="spellEnd"/>
-      <w:r>
-        <w:t>, Query Optimization, Indexing, Data Migration</w:t>
+        <w:t>MySQL, MongoDB, Database Design, Relational Database Modeling, Query Optimization, Indexing, Data Migration</w:t>
       </w:r>
     </w:p>
     <w:p>
@@ -520,15 +446,7 @@
         <w:t>NPM</w:t>
       </w:r>
       <w:r>
-        <w:t xml:space="preserve">, Jira, Slack, FileZilla (FTP), </w:t>
-      </w:r>
-      <w:proofErr w:type="spellStart"/>
-      <w:r>
-        <w:t>Mailtrap</w:t>
-      </w:r>
-      <w:proofErr w:type="spellEnd"/>
-      <w:r>
-        <w:t>, Mailchimp</w:t>
+        <w:t>, Jira, Slack, FileZilla (FTP), Mailtrap, Mailchimp</w:t>
       </w:r>
     </w:p>
     <w:p>
@@ -680,15 +598,7 @@
         <w:t>Poornam Info Vision Pvt Ltd</w:t>
       </w:r>
       <w:r>
-        <w:t xml:space="preserve"> — </w:t>
-      </w:r>
-      <w:proofErr w:type="spellStart"/>
-      <w:r>
-        <w:t>Kakkanad</w:t>
-      </w:r>
-      <w:proofErr w:type="spellEnd"/>
-      <w:r>
-        <w:t>, Ernakulam, Kerala</w:t>
+        <w:t xml:space="preserve"> — Kakkanad, Ernakulam, Kerala</w:t>
       </w:r>
     </w:p>
     <w:p>
@@ -863,7 +773,6 @@
       <w:pPr>
         <w:spacing w:before="280" w:after="40"/>
       </w:pPr>
-      <w:proofErr w:type="spellStart"/>
       <w:r>
         <w:rPr>
           <w:b/>
@@ -872,9 +781,131 @@
           <w:sz w:val="22"/>
           <w:szCs w:val="22"/>
         </w:rPr>
-        <w:t>Pinetech</w:t>
-      </w:r>
-      <w:proofErr w:type="spellEnd"/>
+        <w:t>Pinetech IT Solutions Pvt Ltd</w:t>
+      </w:r>
+      <w:r>
+        <w:t xml:space="preserve"> — Infopark Campus, Koratty, Thrissur, Kerala</w:t>
+      </w:r>
+    </w:p>
+    <w:p>
+      <w:pPr>
+        <w:spacing w:after="40"/>
+      </w:pPr>
+      <w:r>
+        <w:rPr>
+          <w:b/>
+          <w:bCs/>
+        </w:rPr>
+        <w:t>Senior Software Developer and Team Leader</w:t>
+      </w:r>
+    </w:p>
+    <w:p>
+      <w:pPr>
+        <w:spacing w:after="100"/>
+      </w:pPr>
+      <w:r>
+        <w:rPr>
+          <w:i/>
+          <w:iCs/>
+        </w:rPr>
+        <w:t>October 2019 – March 2022</w:t>
+      </w:r>
+    </w:p>
+    <w:p>
+      <w:pPr>
+        <w:pStyle w:val="ListParagraph"/>
+        <w:numPr>
+          <w:ilvl w:val="0"/>
+          <w:numId w:val="1"/>
+        </w:numPr>
+        <w:spacing w:after="60"/>
+      </w:pPr>
+      <w:r>
+        <w:t>Designed and developed web applications using Laravel MVC architecture, WordPress, and Node.js, delivering custom business solutions for clients across multiple industry domains.</w:t>
+      </w:r>
+    </w:p>
+    <w:p>
+      <w:pPr>
+        <w:pStyle w:val="ListParagraph"/>
+        <w:numPr>
+          <w:ilvl w:val="0"/>
+          <w:numId w:val="1"/>
+        </w:numPr>
+        <w:spacing w:after="60"/>
+      </w:pPr>
+      <w:r>
+        <w:t>Engineered custom WordPress plugins and themes tailored to specific business requirements, including admin dashboard functionality, content management workflows, custom post types, and API-driven features.</w:t>
+      </w:r>
+    </w:p>
+    <w:p>
+      <w:pPr>
+        <w:pStyle w:val="ListParagraph"/>
+        <w:numPr>
+          <w:ilvl w:val="0"/>
+          <w:numId w:val="1"/>
+        </w:numPr>
+        <w:spacing w:after="60"/>
+      </w:pPr>
+      <w:r>
+        <w:t>Implemented RESTful API integrations and payment gateway processing (PayPal, Stripe), enabling secure e-commerce transaction handling, order management, and third-party service connectivity.</w:t>
+      </w:r>
+    </w:p>
+    <w:p>
+      <w:pPr>
+        <w:pStyle w:val="ListParagraph"/>
+        <w:numPr>
+          <w:ilvl w:val="0"/>
+          <w:numId w:val="1"/>
+        </w:numPr>
+        <w:spacing w:after="60"/>
+      </w:pPr>
+      <w:r>
+        <w:t>Led a development team as Senior Developer and Team Leader, managing task allocation, conducting code reviews, mentoring junior developers, and ensuring code quality and delivery timelines.</w:t>
+      </w:r>
+    </w:p>
+    <w:p>
+      <w:pPr>
+        <w:pStyle w:val="ListParagraph"/>
+        <w:numPr>
+          <w:ilvl w:val="0"/>
+          <w:numId w:val="1"/>
+        </w:numPr>
+        <w:spacing w:after="60"/>
+      </w:pPr>
+      <w:r>
+        <w:t>Designed MySQL database schemas and optimized queries, indexing, and data migration strategies to support application enhancements, feature additions, and data integrity requirements.</w:t>
+      </w:r>
+    </w:p>
+    <w:p>
+      <w:pPr>
+        <w:pStyle w:val="ListParagraph"/>
+        <w:numPr>
+          <w:ilvl w:val="0"/>
+          <w:numId w:val="1"/>
+        </w:numPr>
+        <w:spacing w:after="60"/>
+      </w:pPr>
+      <w:r>
+        <w:t>Developed automated background processing workflows using cron jobs for scheduled data synchronization, email notifications, report generation, and batch operations.</w:t>
+      </w:r>
+    </w:p>
+    <w:p>
+      <w:pPr>
+        <w:pStyle w:val="ListParagraph"/>
+        <w:numPr>
+          <w:ilvl w:val="0"/>
+          <w:numId w:val="1"/>
+        </w:numPr>
+        <w:spacing w:after="60"/>
+      </w:pPr>
+      <w:r>
+        <w:t>Built responsive frontend interfaces using JavaScript, jQuery, and AJAX, ensuring cross-browser compatibility, mobile responsiveness, and seamless API-driven user interactions.</w:t>
+      </w:r>
+    </w:p>
+    <w:p>
+      <w:pPr>
+        <w:spacing w:before="280" w:after="40"/>
+      </w:pPr>
       <w:r>
         <w:rPr>
           <w:b/>
@@ -883,183 +914,10 @@
           <w:sz w:val="22"/>
           <w:szCs w:val="22"/>
         </w:rPr>
-        <w:t xml:space="preserve"> IT Solutions Pvt Ltd</w:t>
-      </w:r>
-      <w:r>
-        <w:t xml:space="preserve"> — </w:t>
-      </w:r>
-      <w:proofErr w:type="spellStart"/>
-      <w:r>
-        <w:t>Infopark</w:t>
-      </w:r>
-      <w:proofErr w:type="spellEnd"/>
-      <w:r>
-        <w:t xml:space="preserve"> Campus, </w:t>
-      </w:r>
-      <w:proofErr w:type="spellStart"/>
-      <w:r>
-        <w:t>Koratty</w:t>
-      </w:r>
-      <w:proofErr w:type="spellEnd"/>
-      <w:r>
-        <w:t>, Thrissur, Kerala</w:t>
-      </w:r>
-    </w:p>
-    <w:p>
-      <w:pPr>
-        <w:spacing w:after="40"/>
-      </w:pPr>
-      <w:r>
-        <w:rPr>
-          <w:b/>
-          <w:bCs/>
-        </w:rPr>
-        <w:t>Senior Software Developer and Team Leader</w:t>
-      </w:r>
-    </w:p>
-    <w:p>
-      <w:pPr>
-        <w:spacing w:after="100"/>
-      </w:pPr>
-      <w:r>
-        <w:rPr>
-          <w:i/>
-          <w:iCs/>
-        </w:rPr>
-        <w:t>October 2019 – March 2022</w:t>
-      </w:r>
-    </w:p>
-    <w:p>
-      <w:pPr>
-        <w:pStyle w:val="ListParagraph"/>
-        <w:numPr>
-          <w:ilvl w:val="0"/>
-          <w:numId w:val="1"/>
-        </w:numPr>
-        <w:spacing w:after="60"/>
-      </w:pPr>
-      <w:r>
-        <w:t>Designed and developed web applications using Laravel MVC architecture, WordPress, and Node.js, delivering custom business solutions for clients across multiple industry domains.</w:t>
-      </w:r>
-    </w:p>
-    <w:p>
-      <w:pPr>
-        <w:pStyle w:val="ListParagraph"/>
-        <w:numPr>
-          <w:ilvl w:val="0"/>
-          <w:numId w:val="1"/>
-        </w:numPr>
-        <w:spacing w:after="60"/>
-      </w:pPr>
-      <w:r>
-        <w:t>Engineered custom WordPress plugins and themes tailored to specific business requirements, including admin dashboard functionality, content management workflows, custom post types, and API-driven features.</w:t>
-      </w:r>
-    </w:p>
-    <w:p>
-      <w:pPr>
-        <w:pStyle w:val="ListParagraph"/>
-        <w:numPr>
-          <w:ilvl w:val="0"/>
-          <w:numId w:val="1"/>
-        </w:numPr>
-        <w:spacing w:after="60"/>
-      </w:pPr>
-      <w:r>
-        <w:t>Implemented RESTful API integrations and payment gateway processing (PayPal, Stripe), enabling secure e-commerce transaction handling, order management, and third-party service connectivity.</w:t>
-      </w:r>
-    </w:p>
-    <w:p>
-      <w:pPr>
-        <w:pStyle w:val="ListParagraph"/>
-        <w:numPr>
-          <w:ilvl w:val="0"/>
-          <w:numId w:val="1"/>
-        </w:numPr>
-        <w:spacing w:after="60"/>
-      </w:pPr>
-      <w:r>
-        <w:t>Led a development team as Senior Developer and Team Leader, managing task allocation, conducting code reviews, mentoring junior developers, and ensuring code quality and delivery timelines.</w:t>
-      </w:r>
-    </w:p>
-    <w:p>
-      <w:pPr>
-        <w:pStyle w:val="ListParagraph"/>
-        <w:numPr>
-          <w:ilvl w:val="0"/>
-          <w:numId w:val="1"/>
-        </w:numPr>
-        <w:spacing w:after="60"/>
-      </w:pPr>
-      <w:r>
-        <w:t>Designed MySQL database schemas and optimized queries, indexing, and data migration strategies to support application enhancements, feature additions, and data integrity requirements.</w:t>
-      </w:r>
-    </w:p>
-    <w:p>
-      <w:pPr>
-        <w:pStyle w:val="ListParagraph"/>
-        <w:numPr>
-          <w:ilvl w:val="0"/>
-          <w:numId w:val="1"/>
-        </w:numPr>
-        <w:spacing w:after="60"/>
-      </w:pPr>
-      <w:r>
-        <w:t xml:space="preserve">Developed automated background processing workflows using </w:t>
-      </w:r>
-      <w:proofErr w:type="spellStart"/>
-      <w:r>
-        <w:t>cron</w:t>
-      </w:r>
-      <w:proofErr w:type="spellEnd"/>
-      <w:r>
-        <w:t xml:space="preserve"> jobs for scheduled data synchronization, email notifications, report generation, and batch operations.</w:t>
-      </w:r>
-    </w:p>
-    <w:p>
-      <w:pPr>
-        <w:pStyle w:val="ListParagraph"/>
-        <w:numPr>
-          <w:ilvl w:val="0"/>
-          <w:numId w:val="1"/>
-        </w:numPr>
-        <w:spacing w:after="60"/>
-      </w:pPr>
-      <w:r>
-        <w:t>Built responsive frontend interfaces using JavaScript, jQuery, and AJAX, ensuring cross-browser compatibility, mobile responsiveness, and seamless API-driven user interactions.</w:t>
-      </w:r>
-    </w:p>
-    <w:p>
-      <w:pPr>
-        <w:spacing w:before="280" w:after="40"/>
-      </w:pPr>
-      <w:r>
-        <w:rPr>
-          <w:b/>
-          <w:bCs/>
-          <w:color w:val="1B2A4A"/>
-          <w:sz w:val="22"/>
-          <w:szCs w:val="22"/>
-        </w:rPr>
         <w:t>Squad Technologies Pvt Ltd</w:t>
       </w:r>
       <w:r>
-        <w:t xml:space="preserve"> — </w:t>
-      </w:r>
-      <w:proofErr w:type="spellStart"/>
-      <w:r>
-        <w:t>Infopark</w:t>
-      </w:r>
-      <w:proofErr w:type="spellEnd"/>
-      <w:r>
-        <w:t xml:space="preserve"> Campus, </w:t>
-      </w:r>
-      <w:proofErr w:type="spellStart"/>
-      <w:r>
-        <w:t>Koratty</w:t>
-      </w:r>
-      <w:proofErr w:type="spellEnd"/>
-      <w:r>
-        <w:t>, Thrissur, Kerala</w:t>
+        <w:t xml:space="preserve"> — Infopark Campus, Koratty, Thrissur, Kerala</w:t>
       </w:r>
     </w:p>
     <w:p>
@@ -1235,15 +1093,7 @@
         <w:spacing w:after="80"/>
       </w:pPr>
       <w:r>
-        <w:t xml:space="preserve">Architected and developed booking platforms with real-time third-party API integration for hotel and activity availability, payment processing through PayPal and Stripe, XML and JSON data interchange, </w:t>
-      </w:r>
-      <w:proofErr w:type="spellStart"/>
-      <w:r>
-        <w:t>cron</w:t>
-      </w:r>
-      <w:proofErr w:type="spellEnd"/>
-      <w:r>
-        <w:t>-based background synchronization, user account management, and comprehensive data encryption and security.</w:t>
+        <w:t>Architected and developed booking platforms with real-time third-party API integration for hotel and activity availability, payment processing through PayPal and Stripe, XML and JSON data interchange, cron-based background synchronization, user account management, and comprehensive data encryption and security.</w:t>
       </w:r>
     </w:p>
     <w:p>
@@ -1285,15 +1135,7 @@
         <w:spacing w:after="80"/>
       </w:pPr>
       <w:r>
-        <w:t xml:space="preserve">Developed financial calculation modules including discount and loan calculators, Google Maps and geolocation API integrations, automated data processing via </w:t>
-      </w:r>
-      <w:proofErr w:type="spellStart"/>
-      <w:r>
-        <w:t>cron</w:t>
-      </w:r>
-      <w:proofErr w:type="spellEnd"/>
-      <w:r>
-        <w:t xml:space="preserve"> jobs, and business reporting with data export capabilities in PDF, Excel, and CSV formats.</w:t>
+        <w:t>Developed financial calculation modules including discount and loan calculators, Google Maps and geolocation API integrations, automated data processing via cron jobs, and business reporting with data export capabilities in PDF, Excel, and CSV formats.</w:t>
       </w:r>
     </w:p>
     <w:p>
@@ -1413,15 +1255,7 @@
         <w:t xml:space="preserve">Performance Optimization: </w:t>
       </w:r>
       <w:r>
-        <w:t xml:space="preserve">Optimized database queries, application workflows, </w:t>
-      </w:r>
-      <w:proofErr w:type="spellStart"/>
-      <w:r>
-        <w:t>cron</w:t>
-      </w:r>
-      <w:proofErr w:type="spellEnd"/>
-      <w:r>
-        <w:t xml:space="preserve"> processing, and API response handling to improve overall application performance, reduce server load, and enhance user experience.</w:t>
+        <w:t>Optimized database queries, application workflows, cron processing, and API response handling to improve overall application performance, reduce server load, and enhance user experience.</w:t>
       </w:r>
     </w:p>
     <w:p>
@@ -1473,15 +1307,7 @@
         <w:t>Master of Computer Application (MCA)</w:t>
       </w:r>
       <w:r>
-        <w:t xml:space="preserve"> — PSNA College of Engineering and Technology, </w:t>
-      </w:r>
-      <w:proofErr w:type="spellStart"/>
-      <w:r>
-        <w:t>Dindigul</w:t>
-      </w:r>
-      <w:proofErr w:type="spellEnd"/>
-      <w:r>
-        <w:t xml:space="preserve"> | 2011 – 2014</w:t>
+        <w:t xml:space="preserve"> — PSNA College of Engineering and Technology, Dindigul | 2011 – 2014</w:t>
       </w:r>
     </w:p>
     <w:p>

</xml_diff>